<commit_message>
Complete remaining Stores schema decisions
</commit_message>
<xml_diff>
--- a/target-dotnet/docs/SESS_ERP_Advanced_Mobile_Service_Module_Guideline.docx
+++ b/target-dotnet/docs/SESS_ERP_Advanced_Mobile_Service_Module_Guideline.docx
@@ -1088,7 +1088,7 @@
     </w:p>
     <w:p>
       <w:r>
-        <w:t>A new machine ledger must be created when a service request is received and the machine does not already exist. It applies equally to SESS machines and other-brand machines. The ledger must remain independent of any single service contract so that history continues even after warranty, AMC or CAMC expires.</w:t>
+        <w:t>A new machine ledger must be created when a service request is received and the machine does not already exist. It applies equally to SESS machines and other-brand machines. The ledger remains independent of any single service contract so history continues after warranty, AMC or CAMC expires. Other-brand machines use the same ledger shape but have no SESS Job Order and no SESS warranty.</w:t>
       </w:r>
     </w:p>
     <w:p>
@@ -3541,11 +3541,7 @@
               <w:spacing w:after="0" w:line="240" w:lineRule="auto"/>
             </w:pPr>
             <w:r>
-              <w:rPr>
-                <w:rFonts w:ascii="Aptos" w:hAnsi="Aptos"/>
-                <w:sz w:val="17"/>
-              </w:rPr>
-              <w:t>Entitlement and manager/Stores approval as configured; non-covered items require customer/commercial approval</w:t>
+              <w:t>ERP displays entitlement; SERVICE_MANAGER approves Warranty, AMC and CAMC material. Any material without a customer PO requires TECHNICAL_DIRECTOR approval before Stores issue.</w:t>
             </w:r>
           </w:p>
         </w:tc>
@@ -3757,11 +3753,7 @@
               <w:spacing w:after="0" w:line="240" w:lineRule="auto"/>
             </w:pPr>
             <w:r>
-              <w:rPr>
-                <w:rFonts w:ascii="Aptos" w:hAnsi="Aptos"/>
-                <w:sz w:val="17"/>
-              </w:rPr>
-              <w:t>Default ownership is customer-owned unless contract/warranty transfers ownership to SESS/manufacturer</w:t>
+              <w:t>Removed parts are customer property and return to the customer. Any different disposition requires an explicit recorded customer instruction on the Service Ticket; contract or warranty never silently transfers ownership.</w:t>
             </w:r>
           </w:p>
         </w:tc>
@@ -3848,7 +3840,7 @@
         </w:numPr>
       </w:pPr>
       <w:r>
-        <w:t>Serialised, high-value, calibrated and safety-critical accessories are recorded as individual lines.</w:t>
+        <w:t>Accessories are recorded as list lines with description, quantity, condition and photo evidence; they are not individually serialized.</w:t>
       </w:r>
     </w:p>
     <w:p>
@@ -3860,7 +3852,7 @@
         </w:numPr>
       </w:pPr>
       <w:r>
-        <w:t>Lower-value accessories use a checklist with description, quantity, condition and photo.</w:t>
+        <w:t>The same list-and-photo evidence rule applies to every accessory class.</w:t>
       </w:r>
     </w:p>
     <w:p>
@@ -4002,11 +3994,7 @@
               <w:spacing w:after="0" w:line="240" w:lineRule="auto"/>
             </w:pPr>
             <w:r>
-              <w:rPr>
-                <w:rFonts w:ascii="Aptos" w:hAnsi="Aptos"/>
-                <w:sz w:val="18"/>
-              </w:rPr>
-              <w:t>First extension up to 30 days</w:t>
+              <w:t>Every extension, including the first</w:t>
             </w:r>
           </w:p>
         </w:tc>
@@ -4026,11 +4014,7 @@
               <w:spacing w:after="0" w:line="240" w:lineRule="auto"/>
             </w:pPr>
             <w:r>
-              <w:rPr>
-                <w:rFonts w:ascii="Aptos" w:hAnsi="Aptos"/>
-                <w:sz w:val="18"/>
-              </w:rPr>
-              <w:t>Service Manager</w:t>
+              <w:t>Technical Director</w:t>
             </w:r>
           </w:p>
         </w:tc>
@@ -4056,11 +4040,7 @@
               <w:spacing w:after="0" w:line="240" w:lineRule="auto"/>
             </w:pPr>
             <w:r>
-              <w:rPr>
-                <w:rFonts w:ascii="Aptos" w:hAnsi="Aptos"/>
-                <w:sz w:val="18"/>
-              </w:rPr>
-              <w:t>Cumulative delay 31–60 days</w:t>
+              <w:t>Cumulative or repeated extension</w:t>
             </w:r>
           </w:p>
         </w:tc>
@@ -4110,11 +4090,7 @@
               <w:spacing w:after="0" w:line="240" w:lineRule="auto"/>
             </w:pPr>
             <w:r>
-              <w:rPr>
-                <w:rFonts w:ascii="Aptos" w:hAnsi="Aptos"/>
-                <w:sz w:val="18"/>
-              </w:rPr>
-              <w:t>More than 60 days, high value, repeat delay or legal/customer risk</w:t>
+              <w:t>High value, legal/customer risk or overdue extension</w:t>
             </w:r>
           </w:p>
         </w:tc>
@@ -4134,11 +4110,7 @@
               <w:spacing w:after="0" w:line="240" w:lineRule="auto"/>
             </w:pPr>
             <w:r>
-              <w:rPr>
-                <w:rFonts w:ascii="Aptos" w:hAnsi="Aptos"/>
-                <w:sz w:val="18"/>
-              </w:rPr>
-              <w:t>TD/MD plus customer written acknowledgement</w:t>
+              <w:t>Technical Director plus customer written acknowledgement when the commitment changes</w:t>
             </w:r>
           </w:p>
         </w:tc>
@@ -4189,11 +4161,7 @@
               <w:spacing w:after="0" w:line="240" w:lineRule="auto"/>
             </w:pPr>
             <w:r>
-              <w:rPr>
-                <w:rFonts w:ascii="Aptos" w:hAnsi="Aptos"/>
-                <w:sz w:val="18"/>
-              </w:rPr>
-              <w:t>Customer acknowledgement plus internal owner confirmation</w:t>
+              <w:t>Technical Director approval plus customer acknowledgement</w:t>
             </w:r>
           </w:p>
         </w:tc>
@@ -4206,7 +4174,7 @@
     </w:p>
     <w:p>
       <w:r>
-        <w:t>Every extension records the original date, revised date, cause, responsible party, approver, evidence, customer notification and escalation history.</w:t>
+        <w:t>Every extension preserves the immutable original due date and records revised date, cause, responsible party, TECHNICAL_DIRECTOR approval, evidence, customer notification and escalation history.</w:t>
       </w:r>
     </w:p>
     <w:p>
@@ -7060,6 +7028,22 @@
     <w:p>
       <w:pPr>
         <w:pStyle w:val="Heading1"/>
+      </w:pPr>
+      <w:r>
+        <w:t>Stores schema alignment note - 31 August 2026</w:t>
+      </w:r>
+    </w:p>
+    <w:p>
+      <w:pPr>
+        <w:pStyle w:val="Callout"/>
+      </w:pPr>
+      <w:r>
+        <w:t>This later-phase mobile/service guideline is subordinate to the frozen Stores schema decisions. The schema supports PHONE, EMAIL, WHATSAPP and CUSTOMER_PORTAL complaint sources; one installed-machine register for SESS and other-brand machines; list-and-photo accessory evidence; customer ownership of removed parts unless an explicit customer instruction says otherwise; TD approval for every due-date extension; and the settled service-spare authority. Mobile application, offline synchronization and Customer Portal implementation remain deferred.</w:t>
+      </w:r>
+    </w:p>
+    <w:p>
+      <w:pPr>
+        <w:pStyle w:val="Heading1"/>
         <w:keepNext/>
       </w:pPr>
       <w:r>

</xml_diff>

<commit_message>
docs: refresh mobile service module guideline
</commit_message>
<xml_diff>
--- a/target-dotnet/docs/SESS_ERP_Advanced_Mobile_Service_Module_Guideline.docx
+++ b/target-dotnet/docs/SESS_ERP_Advanced_Mobile_Service_Module_Guideline.docx
@@ -1088,7 +1088,7 @@
     </w:p>
     <w:p>
       <w:r>
-        <w:t>A new machine ledger must be created when a service request is received and the machine does not already exist. It applies equally to SESS machines and other-brand machines. The ledger remains independent of any single service contract so history continues after warranty, AMC or CAMC expires. Other-brand machines use the same ledger shape but have no SESS Job Order and no SESS warranty.</w:t>
+        <w:t>A new machine ledger must be created when a service request is received and the machine does not already exist. It applies equally to SESS machines and other-brand machines. The ledger must remain independent of any single service contract so that history continues even after warranty, AMC or CAMC expires.</w:t>
       </w:r>
     </w:p>
     <w:p>
@@ -3541,7 +3541,11 @@
               <w:spacing w:after="0" w:line="240" w:lineRule="auto"/>
             </w:pPr>
             <w:r>
-              <w:t>ERP displays entitlement; SERVICE_MANAGER approves Warranty, AMC and CAMC material. Any material without a customer PO requires TECHNICAL_DIRECTOR approval before Stores issue.</w:t>
+              <w:rPr>
+                <w:rFonts w:ascii="Aptos" w:hAnsi="Aptos"/>
+                <w:sz w:val="17"/>
+              </w:rPr>
+              <w:t>Entitlement and manager/Stores approval as configured; non-covered items require customer/commercial approval</w:t>
             </w:r>
           </w:p>
         </w:tc>
@@ -3753,7 +3757,11 @@
               <w:spacing w:after="0" w:line="240" w:lineRule="auto"/>
             </w:pPr>
             <w:r>
-              <w:t>Removed parts are customer property and return to the customer. Any different disposition requires an explicit recorded customer instruction on the Service Ticket; contract or warranty never silently transfers ownership.</w:t>
+              <w:rPr>
+                <w:rFonts w:ascii="Aptos" w:hAnsi="Aptos"/>
+                <w:sz w:val="17"/>
+              </w:rPr>
+              <w:t>Default ownership is customer-owned unless contract/warranty transfers ownership to SESS/manufacturer</w:t>
             </w:r>
           </w:p>
         </w:tc>
@@ -3840,7 +3848,7 @@
         </w:numPr>
       </w:pPr>
       <w:r>
-        <w:t>Accessories are recorded as list lines with description, quantity, condition and photo evidence; they are not individually serialized.</w:t>
+        <w:t>Serialised, high-value, calibrated and safety-critical accessories are recorded as individual lines.</w:t>
       </w:r>
     </w:p>
     <w:p>
@@ -3852,7 +3860,7 @@
         </w:numPr>
       </w:pPr>
       <w:r>
-        <w:t>The same list-and-photo evidence rule applies to every accessory class.</w:t>
+        <w:t>Lower-value accessories use a checklist with description, quantity, condition and photo.</w:t>
       </w:r>
     </w:p>
     <w:p>
@@ -3994,7 +4002,11 @@
               <w:spacing w:after="0" w:line="240" w:lineRule="auto"/>
             </w:pPr>
             <w:r>
-              <w:t>Every extension, including the first</w:t>
+              <w:rPr>
+                <w:rFonts w:ascii="Aptos" w:hAnsi="Aptos"/>
+                <w:sz w:val="18"/>
+              </w:rPr>
+              <w:t>First extension up to 30 days</w:t>
             </w:r>
           </w:p>
         </w:tc>
@@ -4014,7 +4026,11 @@
               <w:spacing w:after="0" w:line="240" w:lineRule="auto"/>
             </w:pPr>
             <w:r>
-              <w:t>Technical Director</w:t>
+              <w:rPr>
+                <w:rFonts w:ascii="Aptos" w:hAnsi="Aptos"/>
+                <w:sz w:val="18"/>
+              </w:rPr>
+              <w:t>Service Manager</w:t>
             </w:r>
           </w:p>
         </w:tc>
@@ -4040,7 +4056,11 @@
               <w:spacing w:after="0" w:line="240" w:lineRule="auto"/>
             </w:pPr>
             <w:r>
-              <w:t>Cumulative or repeated extension</w:t>
+              <w:rPr>
+                <w:rFonts w:ascii="Aptos" w:hAnsi="Aptos"/>
+                <w:sz w:val="18"/>
+              </w:rPr>
+              <w:t>Cumulative delay 31–60 days</w:t>
             </w:r>
           </w:p>
         </w:tc>
@@ -4090,7 +4110,11 @@
               <w:spacing w:after="0" w:line="240" w:lineRule="auto"/>
             </w:pPr>
             <w:r>
-              <w:t>High value, legal/customer risk or overdue extension</w:t>
+              <w:rPr>
+                <w:rFonts w:ascii="Aptos" w:hAnsi="Aptos"/>
+                <w:sz w:val="18"/>
+              </w:rPr>
+              <w:t>More than 60 days, high value, repeat delay or legal/customer risk</w:t>
             </w:r>
           </w:p>
         </w:tc>
@@ -4110,7 +4134,11 @@
               <w:spacing w:after="0" w:line="240" w:lineRule="auto"/>
             </w:pPr>
             <w:r>
-              <w:t>Technical Director plus customer written acknowledgement when the commitment changes</w:t>
+              <w:rPr>
+                <w:rFonts w:ascii="Aptos" w:hAnsi="Aptos"/>
+                <w:sz w:val="18"/>
+              </w:rPr>
+              <w:t>TD/MD plus customer written acknowledgement</w:t>
             </w:r>
           </w:p>
         </w:tc>
@@ -4161,7 +4189,11 @@
               <w:spacing w:after="0" w:line="240" w:lineRule="auto"/>
             </w:pPr>
             <w:r>
-              <w:t>Technical Director approval plus customer acknowledgement</w:t>
+              <w:rPr>
+                <w:rFonts w:ascii="Aptos" w:hAnsi="Aptos"/>
+                <w:sz w:val="18"/>
+              </w:rPr>
+              <w:t>Customer acknowledgement plus internal owner confirmation</w:t>
             </w:r>
           </w:p>
         </w:tc>
@@ -4174,7 +4206,7 @@
     </w:p>
     <w:p>
       <w:r>
-        <w:t>Every extension preserves the immutable original due date and records revised date, cause, responsible party, TECHNICAL_DIRECTOR approval, evidence, customer notification and escalation history.</w:t>
+        <w:t>Every extension records the original date, revised date, cause, responsible party, approver, evidence, customer notification and escalation history.</w:t>
       </w:r>
     </w:p>
     <w:p>
@@ -7028,22 +7060,6 @@
     <w:p>
       <w:pPr>
         <w:pStyle w:val="Heading1"/>
-      </w:pPr>
-      <w:r>
-        <w:t>Stores schema alignment note - 31 August 2026</w:t>
-      </w:r>
-    </w:p>
-    <w:p>
-      <w:pPr>
-        <w:pStyle w:val="Callout"/>
-      </w:pPr>
-      <w:r>
-        <w:t>This later-phase mobile/service guideline is subordinate to the frozen Stores schema decisions. The schema supports PHONE, EMAIL, WHATSAPP and CUSTOMER_PORTAL complaint sources; one installed-machine register for SESS and other-brand machines; list-and-photo accessory evidence; customer ownership of removed parts unless an explicit customer instruction says otherwise; TD approval for every due-date extension; and the settled service-spare authority. Mobile application, offline synchronization and Customer Portal implementation remain deferred.</w:t>
-      </w:r>
-    </w:p>
-    <w:p>
-      <w:pPr>
-        <w:pStyle w:val="Heading1"/>
         <w:keepNext/>
       </w:pPr>
       <w:r>

</xml_diff>